<commit_message>
added style.css and added text in report
</commit_message>
<xml_diff>
--- a/input/report.docx
+++ b/input/report.docx
@@ -1,13 +1,16 @@
 
 <file path=word/document.xml><?xml version="1.0" encoding="utf-8"?>
-<w:document xmlns:wpc="http://schemas.microsoft.com/office/word/2010/wordprocessingCanvas" xmlns:cx="http://schemas.microsoft.com/office/drawing/2014/chartex" xmlns:cx1="http://schemas.microsoft.com/office/drawing/2015/9/8/chartex" xmlns:cx2="http://schemas.microsoft.com/office/drawing/2015/10/21/chartex" xmlns:cx3="http://schemas.microsoft.com/office/drawing/2016/5/9/chartex" xmlns:cx4="http://schemas.microsoft.com/office/drawing/2016/5/10/chartex" xmlns:cx5="http://schemas.microsoft.com/office/drawing/2016/5/11/chartex" xmlns:cx6="http://schemas.microsoft.com/office/drawing/2016/5/12/chartex" xmlns:cx7="http://schemas.microsoft.com/office/drawing/2016/5/13/chartex" xmlns:cx8="http://schemas.microsoft.com/office/drawing/2016/5/14/chartex" xmlns:mc="http://schemas.openxmlformats.org/markup-compatibility/2006" xmlns:aink="http://schemas.microsoft.com/office/drawing/2016/ink" xmlns:am3d="http://schemas.microsoft.com/office/drawing/2017/model3d" xmlns:o="urn:schemas-microsoft-com:office:office" xmlns:oel="http://schemas.microsoft.com/office/2019/extlst" xmlns:r="http://schemas.openxmlformats.org/officeDocument/2006/relationships" xmlns:m="http://schemas.openxmlformats.org/officeDocument/2006/math" xmlns:v="urn:schemas-microsoft-com:vml" xmlns:wp14="http://schemas.microsoft.com/office/word/2010/wordprocessingDrawing" xmlns:wp="http://schemas.openxmlformats.org/drawingml/2006/wordprocessingDrawing" xmlns:w10="urn:schemas-microsoft-com:office:word" xmlns:w="http://schemas.openxmlformats.org/wordprocessingml/2006/main" xmlns:w14="http://schemas.microsoft.com/office/word/2010/wordml" xmlns:w15="http://schemas.microsoft.com/office/word/2012/wordml" xmlns:w16cei="http://schemas.microsoft.com/office/word/2026/wordml/cei" xmlns:w16cex="http://schemas.microsoft.com/office/word/2018/wordml/cex" xmlns:w16cid="http://schemas.microsoft.com/office/word/2016/wordml/cid" xmlns:w16="http://schemas.microsoft.com/office/word/2018/wordml" xmlns:w16du="http://schemas.microsoft.com/office/word/2023/wordml/word16du" xmlns:w16sdtdh="http://schemas.microsoft.com/office/word/2020/wordml/sdtdatahash" xmlns:w16sdtfl="http://schemas.microsoft.com/office/word/2024/wordml/sdtformatlock" xmlns:w16se="http://schemas.microsoft.com/office/word/2015/wordml/symex" xmlns:wpg="http://schemas.microsoft.com/office/word/2010/wordprocessingGroup" xmlns:wpi="http://schemas.microsoft.com/office/word/2010/wordprocessingInk" xmlns:wne="http://schemas.microsoft.com/office/word/2006/wordml" xmlns:wps="http://schemas.microsoft.com/office/word/2010/wordprocessingShape" mc:Ignorable="w14 w15 w16se w16cid w16 w16cex w16sdtdh w16sdtfl w16du wp14">
+<w:document xmlns:wpc="http://schemas.microsoft.com/office/word/2010/wordprocessingCanvas" xmlns:cx="http://schemas.microsoft.com/office/drawing/2014/chartex" xmlns:cx1="http://schemas.microsoft.com/office/drawing/2015/9/8/chartex" xmlns:cx2="http://schemas.microsoft.com/office/drawing/2015/10/21/chartex" xmlns:cx3="http://schemas.microsoft.com/office/drawing/2016/5/9/chartex" xmlns:cx4="http://schemas.microsoft.com/office/drawing/2016/5/10/chartex" xmlns:cx5="http://schemas.microsoft.com/office/drawing/2016/5/11/chartex" xmlns:cx6="http://schemas.microsoft.com/office/drawing/2016/5/12/chartex" xmlns:cx7="http://schemas.microsoft.com/office/drawing/2016/5/13/chartex" xmlns:cx8="http://schemas.microsoft.com/office/drawing/2016/5/14/chartex" xmlns:mc="http://schemas.openxmlformats.org/markup-compatibility/2006" xmlns:aink="http://schemas.microsoft.com/office/drawing/2016/ink" xmlns:am3d="http://schemas.microsoft.com/office/drawing/2017/model3d" xmlns:o="urn:schemas-microsoft-com:office:office" xmlns:oel="http://schemas.microsoft.com/office/2019/extlst" xmlns:r="http://schemas.openxmlformats.org/officeDocument/2006/relationships" xmlns:m="http://schemas.openxmlformats.org/officeDocument/2006/math" xmlns:v="urn:schemas-microsoft-com:vml" xmlns:wp14="http://schemas.microsoft.com/office/word/2010/wordprocessingDrawing" xmlns:wp="http://schemas.openxmlformats.org/drawingml/2006/wordprocessingDrawing" xmlns:w10="urn:schemas-microsoft-com:office:word" xmlns:w="http://schemas.openxmlformats.org/wordprocessingml/2006/main" xmlns:w14="http://schemas.microsoft.com/office/word/2010/wordml" xmlns:w15="http://schemas.microsoft.com/office/word/2012/wordml" xmlns:w16cex="http://schemas.microsoft.com/office/word/2018/wordml/cex" xmlns:w16cid="http://schemas.microsoft.com/office/word/2016/wordml/cid" xmlns:w16="http://schemas.microsoft.com/office/word/2018/wordml" xmlns:w16du="http://schemas.microsoft.com/office/word/2023/wordml/word16du" xmlns:w16sdtdh="http://schemas.microsoft.com/office/word/2020/wordml/sdtdatahash" xmlns:w16sdtfl="http://schemas.microsoft.com/office/word/2024/wordml/sdtformatlock" xmlns:w16se="http://schemas.microsoft.com/office/word/2015/wordml/symex" xmlns:wpg="http://schemas.microsoft.com/office/word/2010/wordprocessingGroup" xmlns:wpi="http://schemas.microsoft.com/office/word/2010/wordprocessingInk" xmlns:wne="http://schemas.microsoft.com/office/word/2006/wordml" xmlns:wps="http://schemas.microsoft.com/office/word/2010/wordprocessingShape" mc:Ignorable="w14 w15 w16se w16cid w16 w16cex w16sdtdh w16sdtfl w16du wp14">
   <w:body>
     <w:p>
       <w:pPr>
         <w:pStyle w:val="Heading1"/>
       </w:pPr>
       <w:r>
-        <w:t>This is document</w:t>
+        <w:t>D</w:t>
+      </w:r>
+      <w:r>
+        <w:t>ocument</w:t>
       </w:r>
       <w:r>
         <w:t xml:space="preserve"> for test</w:t>
@@ -15,6 +18,9 @@
       <w:r>
         <w:t>ing the function</w:t>
       </w:r>
+      <w:r>
+        <w:t xml:space="preserve"> (H1)</w:t>
+      </w:r>
     </w:p>
     <w:p>
       <w:r>
@@ -46,15 +52,24 @@
     </w:p>
     <w:p>
       <w:pPr>
-        <w:pStyle w:val="Heading1"/>
-      </w:pPr>
-      <w:r>
-        <w:t>Heading 1</w:t>
-      </w:r>
-    </w:p>
-    <w:p>
-      <w:r>
-        <w:t>This section demonstrates content placed under a Heading 1 style.</w:t>
+        <w:pStyle w:val="Heading2"/>
+      </w:pPr>
+      <w:r>
+        <w:t xml:space="preserve">Heading </w:t>
+      </w:r>
+      <w:r>
+        <w:t>(H2)</w:t>
+      </w:r>
+    </w:p>
+    <w:p>
+      <w:r>
+        <w:t xml:space="preserve">This section demonstrates content placed under a Heading </w:t>
+      </w:r>
+      <w:r>
+        <w:t>2</w:t>
+      </w:r>
+      <w:r>
+        <w:t xml:space="preserve"> style.</w:t>
       </w:r>
       <w:r>
         <w:t xml:space="preserve"> </w:t>
@@ -65,7 +80,13 @@
     </w:p>
     <w:p>
       <w:r>
-        <w:t>When rendered through Quarto, it is typically converted to an HTML &lt;h1&gt; element.</w:t>
+        <w:t>When rendered through Quarto, it is typically converted to an HTML &lt;h</w:t>
+      </w:r>
+      <w:r>
+        <w:t>2</w:t>
+      </w:r>
+      <w:r>
+        <w:t>&gt; element.</w:t>
       </w:r>
       <w:r>
         <w:t xml:space="preserve"> </w:t>
@@ -81,15 +102,24 @@
     </w:p>
     <w:p>
       <w:pPr>
-        <w:pStyle w:val="Heading2"/>
-      </w:pPr>
-      <w:r>
-        <w:t>Heading 2</w:t>
-      </w:r>
-    </w:p>
-    <w:p>
-      <w:r>
-        <w:t>This section demonstrates content placed under a Heading 2 style.</w:t>
+        <w:pStyle w:val="Heading3"/>
+      </w:pPr>
+      <w:r>
+        <w:t xml:space="preserve">Heading </w:t>
+      </w:r>
+      <w:r>
+        <w:t>(H3)</w:t>
+      </w:r>
+    </w:p>
+    <w:p>
+      <w:r>
+        <w:t xml:space="preserve">This section demonstrates content placed under a Heading </w:t>
+      </w:r>
+      <w:r>
+        <w:t>3</w:t>
+      </w:r>
+      <w:r>
+        <w:t xml:space="preserve"> style.</w:t>
       </w:r>
       <w:r>
         <w:t xml:space="preserve"> </w:t>
@@ -100,7 +130,13 @@
     </w:p>
     <w:p>
       <w:r>
-        <w:t>When converting a Quarto document to HTML, this heading is generally mapped to an &lt;h2&gt; element.</w:t>
+        <w:t>When converting a Quarto document to HTML, this heading is generally mapped to an &lt;h</w:t>
+      </w:r>
+      <w:r>
+        <w:t>3</w:t>
+      </w:r>
+      <w:r>
+        <w:t>&gt; element.</w:t>
       </w:r>
       <w:r>
         <w:t xml:space="preserve"> </w:t>
@@ -116,28 +152,59 @@
     </w:p>
     <w:p>
       <w:pPr>
-        <w:pStyle w:val="Heading3"/>
-      </w:pPr>
-      <w:r>
+        <w:rPr>
+          <w:b/>
+          <w:bCs/>
+        </w:rPr>
+      </w:pPr>
+      <w:r>
+        <w:rPr>
+          <w:b/>
+          <w:bCs/>
+        </w:rPr>
         <w:t xml:space="preserve">Figure </w:t>
       </w:r>
       <w:r>
+        <w:rPr>
+          <w:b/>
+          <w:bCs/>
+        </w:rPr>
         <w:t>1</w:t>
       </w:r>
       <w:r>
+        <w:rPr>
+          <w:b/>
+          <w:bCs/>
+        </w:rPr>
         <w:t xml:space="preserve"> illustrates how figures </w:t>
       </w:r>
       <w:r>
+        <w:rPr>
+          <w:b/>
+          <w:bCs/>
+        </w:rPr>
         <w:t xml:space="preserve">extracted from the document </w:t>
       </w:r>
       <w:r>
-        <w:t>and captions may appear in the final rendered document.</w:t>
-      </w:r>
-      <w:r>
-        <w:t xml:space="preserve"> I have use H3 for this block of text</w:t>
-      </w:r>
-      <w:r>
+        <w:rPr>
+          <w:b/>
+          <w:bCs/>
+        </w:rPr>
+        <w:t>and captions may appear in the final rendered document</w:t>
+      </w:r>
+      <w:r>
+        <w:rPr>
+          <w:b/>
+          <w:bCs/>
+        </w:rPr>
         <w:t>.</w:t>
+      </w:r>
+      <w:r>
+        <w:rPr>
+          <w:b/>
+          <w:bCs/>
+        </w:rPr>
+        <w:t xml:space="preserve"> This is a bold normal text.</w:t>
       </w:r>
     </w:p>
     <w:p>
@@ -234,22 +301,45 @@
     </w:p>
     <w:p>
       <w:pPr>
-        <w:pStyle w:val="Heading3"/>
-      </w:pPr>
-      <w:r>
+        <w:rPr>
+          <w:b/>
+          <w:bCs/>
+        </w:rPr>
+      </w:pPr>
+      <w:r>
+        <w:rPr>
+          <w:b/>
+          <w:bCs/>
+        </w:rPr>
         <w:t>Figure 2</w:t>
       </w:r>
       <w:r>
+        <w:rPr>
+          <w:b/>
+          <w:bCs/>
+        </w:rPr>
         <w:t xml:space="preserve"> illustrates how figures extracted from the document and may appear in the </w:t>
       </w:r>
       <w:r>
+        <w:rPr>
+          <w:b/>
+          <w:bCs/>
+        </w:rPr>
         <w:t>HTML</w:t>
       </w:r>
       <w:r>
-        <w:t xml:space="preserve"> document. I have use H3 for this block</w:t>
-      </w:r>
-      <w:r>
-        <w:t>.</w:t>
+        <w:rPr>
+          <w:b/>
+          <w:bCs/>
+        </w:rPr>
+        <w:t xml:space="preserve"> document. </w:t>
+      </w:r>
+      <w:r>
+        <w:rPr>
+          <w:b/>
+          <w:bCs/>
+        </w:rPr>
+        <w:t>This is a bold normal text.</w:t>
       </w:r>
     </w:p>
     <w:p>
@@ -365,11 +455,14 @@
     </w:p>
     <w:p>
       <w:pPr>
-        <w:pStyle w:val="Heading1"/>
+        <w:pStyle w:val="Heading2"/>
       </w:pPr>
       <w:r>
         <w:t>Image Placement Instructions and bullet point example</w:t>
       </w:r>
+      <w:r>
+        <w:t xml:space="preserve"> (H2)</w:t>
+      </w:r>
     </w:p>
     <w:p>
       <w:pPr>
@@ -435,11 +528,75 @@
         <w:pStyle w:val="Bulletted"/>
       </w:pPr>
       <w:r>
+        <w:t>Maintain the image aspect ratio when resizing.</w:t>
+      </w:r>
+    </w:p>
+    <w:p>
+      <w:pPr>
+        <w:pStyle w:val="Heading2"/>
+      </w:pPr>
+      <w:r>
         <w:lastRenderedPageBreak/>
-        <w:t>Maintain the image aspect ratio when resizing.</w:t>
-      </w:r>
-    </w:p>
-    <w:p/>
+        <w:t>Play with the style</w:t>
+      </w:r>
+      <w:r>
+        <w:t xml:space="preserve"> (H2)</w:t>
+      </w:r>
+    </w:p>
+    <w:p>
+      <w:r>
+        <w:t>In RStudio, navigate to the output folder and find the style.css file. Open it and try to understand it. You can copy the contents into an AI tool and ask it to explain the CSS line by line or block by block, depending on how familiar you are with CSS.</w:t>
+      </w:r>
+    </w:p>
+    <w:p>
+      <w:pPr>
+        <w:pStyle w:val="Heading3"/>
+      </w:pPr>
+      <w:r>
+        <w:t xml:space="preserve">Have a go at changing some of the CSS and see what happens! </w:t>
+      </w:r>
+      <w:r>
+        <w:t>(H3)</w:t>
+      </w:r>
+    </w:p>
+    <w:p>
+      <w:r>
+        <w:t xml:space="preserve">For example, try changing the h3 font size from 1.3em to </w:t>
+      </w:r>
+      <w:r>
+        <w:t>0</w:t>
+      </w:r>
+      <w:r>
+        <w:t>.5em, or change the text colour in body from #1A1A1A to another colour. Make one change at a time and see how it affects the output.</w:t>
+      </w:r>
+      <w:r>
+        <w:t xml:space="preserve"> </w:t>
+      </w:r>
+      <w:r>
+        <w:t xml:space="preserve"> </w:t>
+      </w:r>
+    </w:p>
+    <w:p>
+      <w:r>
+        <w:t xml:space="preserve">What do you think this </w:t>
+      </w:r>
+      <w:r>
+        <w:rPr>
+          <w:b/>
+          <w:bCs/>
+        </w:rPr>
+        <w:t>.sr-only</w:t>
+      </w:r>
+      <w:r>
+        <w:t xml:space="preserve"> </w:t>
+      </w:r>
+      <w:r>
+        <w:t xml:space="preserve">block </w:t>
+      </w:r>
+      <w:r>
+        <w:t xml:space="preserve">may be used for? </w:t>
+      </w:r>
+    </w:p>
     <w:sectPr>
       <w:footerReference w:type="default" r:id="rId11"/>
       <w:headerReference w:type="first" r:id="rId12"/>
@@ -455,7 +612,7 @@
 </file>
 
 <file path=word/endnotes.xml><?xml version="1.0" encoding="utf-8"?>
-<w:endnotes xmlns:wpc="http://schemas.microsoft.com/office/word/2010/wordprocessingCanvas" xmlns:cx="http://schemas.microsoft.com/office/drawing/2014/chartex" xmlns:cx1="http://schemas.microsoft.com/office/drawing/2015/9/8/chartex" xmlns:cx2="http://schemas.microsoft.com/office/drawing/2015/10/21/chartex" xmlns:cx3="http://schemas.microsoft.com/office/drawing/2016/5/9/chartex" xmlns:cx4="http://schemas.microsoft.com/office/drawing/2016/5/10/chartex" xmlns:cx5="http://schemas.microsoft.com/office/drawing/2016/5/11/chartex" xmlns:cx6="http://schemas.microsoft.com/office/drawing/2016/5/12/chartex" xmlns:cx7="http://schemas.microsoft.com/office/drawing/2016/5/13/chartex" xmlns:cx8="http://schemas.microsoft.com/office/drawing/2016/5/14/chartex" xmlns:mc="http://schemas.openxmlformats.org/markup-compatibility/2006" xmlns:aink="http://schemas.microsoft.com/office/drawing/2016/ink" xmlns:am3d="http://schemas.microsoft.com/office/drawing/2017/model3d" xmlns:o="urn:schemas-microsoft-com:office:office" xmlns:oel="http://schemas.microsoft.com/office/2019/extlst" xmlns:r="http://schemas.openxmlformats.org/officeDocument/2006/relationships" xmlns:m="http://schemas.openxmlformats.org/officeDocument/2006/math" xmlns:v="urn:schemas-microsoft-com:vml" xmlns:wp14="http://schemas.microsoft.com/office/word/2010/wordprocessingDrawing" xmlns:wp="http://schemas.openxmlformats.org/drawingml/2006/wordprocessingDrawing" xmlns:w10="urn:schemas-microsoft-com:office:word" xmlns:w="http://schemas.openxmlformats.org/wordprocessingml/2006/main" xmlns:w14="http://schemas.microsoft.com/office/word/2010/wordml" xmlns:w15="http://schemas.microsoft.com/office/word/2012/wordml" xmlns:w16cei="http://schemas.microsoft.com/office/word/2026/wordml/cei" xmlns:w16cex="http://schemas.microsoft.com/office/word/2018/wordml/cex" xmlns:w16cid="http://schemas.microsoft.com/office/word/2016/wordml/cid" xmlns:w16="http://schemas.microsoft.com/office/word/2018/wordml" xmlns:w16du="http://schemas.microsoft.com/office/word/2023/wordml/word16du" xmlns:w16sdtdh="http://schemas.microsoft.com/office/word/2020/wordml/sdtdatahash" xmlns:w16sdtfl="http://schemas.microsoft.com/office/word/2024/wordml/sdtformatlock" xmlns:w16se="http://schemas.microsoft.com/office/word/2015/wordml/symex" xmlns:wpg="http://schemas.microsoft.com/office/word/2010/wordprocessingGroup" xmlns:wpi="http://schemas.microsoft.com/office/word/2010/wordprocessingInk" xmlns:wne="http://schemas.microsoft.com/office/word/2006/wordml" xmlns:wps="http://schemas.microsoft.com/office/word/2010/wordprocessingShape" mc:Ignorable="w14 w15 w16se w16cid w16 w16cex w16sdtdh w16sdtfl w16du wp14">
+<w:endnotes xmlns:wpc="http://schemas.microsoft.com/office/word/2010/wordprocessingCanvas" xmlns:cx="http://schemas.microsoft.com/office/drawing/2014/chartex" xmlns:cx1="http://schemas.microsoft.com/office/drawing/2015/9/8/chartex" xmlns:cx2="http://schemas.microsoft.com/office/drawing/2015/10/21/chartex" xmlns:cx3="http://schemas.microsoft.com/office/drawing/2016/5/9/chartex" xmlns:cx4="http://schemas.microsoft.com/office/drawing/2016/5/10/chartex" xmlns:cx5="http://schemas.microsoft.com/office/drawing/2016/5/11/chartex" xmlns:cx6="http://schemas.microsoft.com/office/drawing/2016/5/12/chartex" xmlns:cx7="http://schemas.microsoft.com/office/drawing/2016/5/13/chartex" xmlns:cx8="http://schemas.microsoft.com/office/drawing/2016/5/14/chartex" xmlns:mc="http://schemas.openxmlformats.org/markup-compatibility/2006" xmlns:aink="http://schemas.microsoft.com/office/drawing/2016/ink" xmlns:am3d="http://schemas.microsoft.com/office/drawing/2017/model3d" xmlns:o="urn:schemas-microsoft-com:office:office" xmlns:oel="http://schemas.microsoft.com/office/2019/extlst" xmlns:r="http://schemas.openxmlformats.org/officeDocument/2006/relationships" xmlns:m="http://schemas.openxmlformats.org/officeDocument/2006/math" xmlns:v="urn:schemas-microsoft-com:vml" xmlns:wp14="http://schemas.microsoft.com/office/word/2010/wordprocessingDrawing" xmlns:wp="http://schemas.openxmlformats.org/drawingml/2006/wordprocessingDrawing" xmlns:w10="urn:schemas-microsoft-com:office:word" xmlns:w="http://schemas.openxmlformats.org/wordprocessingml/2006/main" xmlns:w14="http://schemas.microsoft.com/office/word/2010/wordml" xmlns:w15="http://schemas.microsoft.com/office/word/2012/wordml" xmlns:w16cex="http://schemas.microsoft.com/office/word/2018/wordml/cex" xmlns:w16cid="http://schemas.microsoft.com/office/word/2016/wordml/cid" xmlns:w16="http://schemas.microsoft.com/office/word/2018/wordml" xmlns:w16du="http://schemas.microsoft.com/office/word/2023/wordml/word16du" xmlns:w16sdtdh="http://schemas.microsoft.com/office/word/2020/wordml/sdtdatahash" xmlns:w16sdtfl="http://schemas.microsoft.com/office/word/2024/wordml/sdtformatlock" xmlns:w16se="http://schemas.microsoft.com/office/word/2015/wordml/symex" xmlns:wpg="http://schemas.microsoft.com/office/word/2010/wordprocessingGroup" xmlns:wpi="http://schemas.microsoft.com/office/word/2010/wordprocessingInk" xmlns:wne="http://schemas.microsoft.com/office/word/2006/wordml" xmlns:wps="http://schemas.microsoft.com/office/word/2010/wordprocessingShape" mc:Ignorable="w14 w15 w16se w16cid w16 w16cex w16sdtdh w16sdtfl w16du wp14">
   <w:endnote w:type="separator" w:id="-1">
     <w:p>
       <w:r>
@@ -474,7 +631,7 @@
 </file>
 
 <file path=word/footer1.xml><?xml version="1.0" encoding="utf-8"?>
-<w:ftr xmlns:wpc="http://schemas.microsoft.com/office/word/2010/wordprocessingCanvas" xmlns:cx="http://schemas.microsoft.com/office/drawing/2014/chartex" xmlns:cx1="http://schemas.microsoft.com/office/drawing/2015/9/8/chartex" xmlns:cx2="http://schemas.microsoft.com/office/drawing/2015/10/21/chartex" xmlns:cx3="http://schemas.microsoft.com/office/drawing/2016/5/9/chartex" xmlns:cx4="http://schemas.microsoft.com/office/drawing/2016/5/10/chartex" xmlns:cx5="http://schemas.microsoft.com/office/drawing/2016/5/11/chartex" xmlns:cx6="http://schemas.microsoft.com/office/drawing/2016/5/12/chartex" xmlns:cx7="http://schemas.microsoft.com/office/drawing/2016/5/13/chartex" xmlns:cx8="http://schemas.microsoft.com/office/drawing/2016/5/14/chartex" xmlns:mc="http://schemas.openxmlformats.org/markup-compatibility/2006" xmlns:aink="http://schemas.microsoft.com/office/drawing/2016/ink" xmlns:am3d="http://schemas.microsoft.com/office/drawing/2017/model3d" xmlns:o="urn:schemas-microsoft-com:office:office" xmlns:oel="http://schemas.microsoft.com/office/2019/extlst" xmlns:r="http://schemas.openxmlformats.org/officeDocument/2006/relationships" xmlns:m="http://schemas.openxmlformats.org/officeDocument/2006/math" xmlns:v="urn:schemas-microsoft-com:vml" xmlns:wp14="http://schemas.microsoft.com/office/word/2010/wordprocessingDrawing" xmlns:wp="http://schemas.openxmlformats.org/drawingml/2006/wordprocessingDrawing" xmlns:w10="urn:schemas-microsoft-com:office:word" xmlns:w="http://schemas.openxmlformats.org/wordprocessingml/2006/main" xmlns:w14="http://schemas.microsoft.com/office/word/2010/wordml" xmlns:w15="http://schemas.microsoft.com/office/word/2012/wordml" xmlns:w16cei="http://schemas.microsoft.com/office/word/2026/wordml/cei" xmlns:w16cex="http://schemas.microsoft.com/office/word/2018/wordml/cex" xmlns:w16cid="http://schemas.microsoft.com/office/word/2016/wordml/cid" xmlns:w16="http://schemas.microsoft.com/office/word/2018/wordml" xmlns:w16du="http://schemas.microsoft.com/office/word/2023/wordml/word16du" xmlns:w16sdtdh="http://schemas.microsoft.com/office/word/2020/wordml/sdtdatahash" xmlns:w16sdtfl="http://schemas.microsoft.com/office/word/2024/wordml/sdtformatlock" xmlns:w16se="http://schemas.microsoft.com/office/word/2015/wordml/symex" xmlns:wpg="http://schemas.microsoft.com/office/word/2010/wordprocessingGroup" xmlns:wpi="http://schemas.microsoft.com/office/word/2010/wordprocessingInk" xmlns:wne="http://schemas.microsoft.com/office/word/2006/wordml" xmlns:wps="http://schemas.microsoft.com/office/word/2010/wordprocessingShape" mc:Ignorable="w14 w15 w16se w16cid w16 w16cex w16sdtdh w16sdtfl w16du wp14">
+<w:ftr xmlns:wpc="http://schemas.microsoft.com/office/word/2010/wordprocessingCanvas" xmlns:cx="http://schemas.microsoft.com/office/drawing/2014/chartex" xmlns:cx1="http://schemas.microsoft.com/office/drawing/2015/9/8/chartex" xmlns:cx2="http://schemas.microsoft.com/office/drawing/2015/10/21/chartex" xmlns:cx3="http://schemas.microsoft.com/office/drawing/2016/5/9/chartex" xmlns:cx4="http://schemas.microsoft.com/office/drawing/2016/5/10/chartex" xmlns:cx5="http://schemas.microsoft.com/office/drawing/2016/5/11/chartex" xmlns:cx6="http://schemas.microsoft.com/office/drawing/2016/5/12/chartex" xmlns:cx7="http://schemas.microsoft.com/office/drawing/2016/5/13/chartex" xmlns:cx8="http://schemas.microsoft.com/office/drawing/2016/5/14/chartex" xmlns:mc="http://schemas.openxmlformats.org/markup-compatibility/2006" xmlns:aink="http://schemas.microsoft.com/office/drawing/2016/ink" xmlns:am3d="http://schemas.microsoft.com/office/drawing/2017/model3d" xmlns:o="urn:schemas-microsoft-com:office:office" xmlns:oel="http://schemas.microsoft.com/office/2019/extlst" xmlns:r="http://schemas.openxmlformats.org/officeDocument/2006/relationships" xmlns:m="http://schemas.openxmlformats.org/officeDocument/2006/math" xmlns:v="urn:schemas-microsoft-com:vml" xmlns:wp14="http://schemas.microsoft.com/office/word/2010/wordprocessingDrawing" xmlns:wp="http://schemas.openxmlformats.org/drawingml/2006/wordprocessingDrawing" xmlns:w10="urn:schemas-microsoft-com:office:word" xmlns:w="http://schemas.openxmlformats.org/wordprocessingml/2006/main" xmlns:w14="http://schemas.microsoft.com/office/word/2010/wordml" xmlns:w15="http://schemas.microsoft.com/office/word/2012/wordml" xmlns:w16cex="http://schemas.microsoft.com/office/word/2018/wordml/cex" xmlns:w16cid="http://schemas.microsoft.com/office/word/2016/wordml/cid" xmlns:w16="http://schemas.microsoft.com/office/word/2018/wordml" xmlns:w16du="http://schemas.microsoft.com/office/word/2023/wordml/word16du" xmlns:w16sdtdh="http://schemas.microsoft.com/office/word/2020/wordml/sdtdatahash" xmlns:w16sdtfl="http://schemas.microsoft.com/office/word/2024/wordml/sdtformatlock" xmlns:w16se="http://schemas.microsoft.com/office/word/2015/wordml/symex" xmlns:wpg="http://schemas.microsoft.com/office/word/2010/wordprocessingGroup" xmlns:wpi="http://schemas.microsoft.com/office/word/2010/wordprocessingInk" xmlns:wne="http://schemas.microsoft.com/office/word/2006/wordml" xmlns:wps="http://schemas.microsoft.com/office/word/2010/wordprocessingShape" mc:Ignorable="w14 w15 w16se w16cid w16 w16cex w16sdtdh w16sdtfl w16du wp14">
   <w:sdt>
     <w:sdtPr>
       <w:id w:val="-1642106266"/>
@@ -517,7 +674,7 @@
 </file>
 
 <file path=word/footnotes.xml><?xml version="1.0" encoding="utf-8"?>
-<w:footnotes xmlns:wpc="http://schemas.microsoft.com/office/word/2010/wordprocessingCanvas" xmlns:cx="http://schemas.microsoft.com/office/drawing/2014/chartex" xmlns:cx1="http://schemas.microsoft.com/office/drawing/2015/9/8/chartex" xmlns:cx2="http://schemas.microsoft.com/office/drawing/2015/10/21/chartex" xmlns:cx3="http://schemas.microsoft.com/office/drawing/2016/5/9/chartex" xmlns:cx4="http://schemas.microsoft.com/office/drawing/2016/5/10/chartex" xmlns:cx5="http://schemas.microsoft.com/office/drawing/2016/5/11/chartex" xmlns:cx6="http://schemas.microsoft.com/office/drawing/2016/5/12/chartex" xmlns:cx7="http://schemas.microsoft.com/office/drawing/2016/5/13/chartex" xmlns:cx8="http://schemas.microsoft.com/office/drawing/2016/5/14/chartex" xmlns:mc="http://schemas.openxmlformats.org/markup-compatibility/2006" xmlns:aink="http://schemas.microsoft.com/office/drawing/2016/ink" xmlns:am3d="http://schemas.microsoft.com/office/drawing/2017/model3d" xmlns:o="urn:schemas-microsoft-com:office:office" xmlns:oel="http://schemas.microsoft.com/office/2019/extlst" xmlns:r="http://schemas.openxmlformats.org/officeDocument/2006/relationships" xmlns:m="http://schemas.openxmlformats.org/officeDocument/2006/math" xmlns:v="urn:schemas-microsoft-com:vml" xmlns:wp14="http://schemas.microsoft.com/office/word/2010/wordprocessingDrawing" xmlns:wp="http://schemas.openxmlformats.org/drawingml/2006/wordprocessingDrawing" xmlns:w10="urn:schemas-microsoft-com:office:word" xmlns:w="http://schemas.openxmlformats.org/wordprocessingml/2006/main" xmlns:w14="http://schemas.microsoft.com/office/word/2010/wordml" xmlns:w15="http://schemas.microsoft.com/office/word/2012/wordml" xmlns:w16cei="http://schemas.microsoft.com/office/word/2026/wordml/cei" xmlns:w16cex="http://schemas.microsoft.com/office/word/2018/wordml/cex" xmlns:w16cid="http://schemas.microsoft.com/office/word/2016/wordml/cid" xmlns:w16="http://schemas.microsoft.com/office/word/2018/wordml" xmlns:w16du="http://schemas.microsoft.com/office/word/2023/wordml/word16du" xmlns:w16sdtdh="http://schemas.microsoft.com/office/word/2020/wordml/sdtdatahash" xmlns:w16sdtfl="http://schemas.microsoft.com/office/word/2024/wordml/sdtformatlock" xmlns:w16se="http://schemas.microsoft.com/office/word/2015/wordml/symex" xmlns:wpg="http://schemas.microsoft.com/office/word/2010/wordprocessingGroup" xmlns:wpi="http://schemas.microsoft.com/office/word/2010/wordprocessingInk" xmlns:wne="http://schemas.microsoft.com/office/word/2006/wordml" xmlns:wps="http://schemas.microsoft.com/office/word/2010/wordprocessingShape" mc:Ignorable="w14 w15 w16se w16cid w16 w16cex w16sdtdh w16sdtfl w16du wp14">
+<w:footnotes xmlns:wpc="http://schemas.microsoft.com/office/word/2010/wordprocessingCanvas" xmlns:cx="http://schemas.microsoft.com/office/drawing/2014/chartex" xmlns:cx1="http://schemas.microsoft.com/office/drawing/2015/9/8/chartex" xmlns:cx2="http://schemas.microsoft.com/office/drawing/2015/10/21/chartex" xmlns:cx3="http://schemas.microsoft.com/office/drawing/2016/5/9/chartex" xmlns:cx4="http://schemas.microsoft.com/office/drawing/2016/5/10/chartex" xmlns:cx5="http://schemas.microsoft.com/office/drawing/2016/5/11/chartex" xmlns:cx6="http://schemas.microsoft.com/office/drawing/2016/5/12/chartex" xmlns:cx7="http://schemas.microsoft.com/office/drawing/2016/5/13/chartex" xmlns:cx8="http://schemas.microsoft.com/office/drawing/2016/5/14/chartex" xmlns:mc="http://schemas.openxmlformats.org/markup-compatibility/2006" xmlns:aink="http://schemas.microsoft.com/office/drawing/2016/ink" xmlns:am3d="http://schemas.microsoft.com/office/drawing/2017/model3d" xmlns:o="urn:schemas-microsoft-com:office:office" xmlns:oel="http://schemas.microsoft.com/office/2019/extlst" xmlns:r="http://schemas.openxmlformats.org/officeDocument/2006/relationships" xmlns:m="http://schemas.openxmlformats.org/officeDocument/2006/math" xmlns:v="urn:schemas-microsoft-com:vml" xmlns:wp14="http://schemas.microsoft.com/office/word/2010/wordprocessingDrawing" xmlns:wp="http://schemas.openxmlformats.org/drawingml/2006/wordprocessingDrawing" xmlns:w10="urn:schemas-microsoft-com:office:word" xmlns:w="http://schemas.openxmlformats.org/wordprocessingml/2006/main" xmlns:w14="http://schemas.microsoft.com/office/word/2010/wordml" xmlns:w15="http://schemas.microsoft.com/office/word/2012/wordml" xmlns:w16cex="http://schemas.microsoft.com/office/word/2018/wordml/cex" xmlns:w16cid="http://schemas.microsoft.com/office/word/2016/wordml/cid" xmlns:w16="http://schemas.microsoft.com/office/word/2018/wordml" xmlns:w16du="http://schemas.microsoft.com/office/word/2023/wordml/word16du" xmlns:w16sdtdh="http://schemas.microsoft.com/office/word/2020/wordml/sdtdatahash" xmlns:w16sdtfl="http://schemas.microsoft.com/office/word/2024/wordml/sdtformatlock" xmlns:w16se="http://schemas.microsoft.com/office/word/2015/wordml/symex" xmlns:wpg="http://schemas.microsoft.com/office/word/2010/wordprocessingGroup" xmlns:wpi="http://schemas.microsoft.com/office/word/2010/wordprocessingInk" xmlns:wne="http://schemas.microsoft.com/office/word/2006/wordml" xmlns:wps="http://schemas.microsoft.com/office/word/2010/wordprocessingShape" mc:Ignorable="w14 w15 w16se w16cid w16 w16cex w16sdtdh w16sdtfl w16du wp14">
   <w:footnote w:type="separator" w:id="-1">
     <w:p>
       <w:r>
@@ -536,7 +693,7 @@
 </file>
 
 <file path=word/header1.xml><?xml version="1.0" encoding="utf-8"?>
-<w:hdr xmlns:wpc="http://schemas.microsoft.com/office/word/2010/wordprocessingCanvas" xmlns:cx="http://schemas.microsoft.com/office/drawing/2014/chartex" xmlns:cx1="http://schemas.microsoft.com/office/drawing/2015/9/8/chartex" xmlns:cx2="http://schemas.microsoft.com/office/drawing/2015/10/21/chartex" xmlns:cx3="http://schemas.microsoft.com/office/drawing/2016/5/9/chartex" xmlns:cx4="http://schemas.microsoft.com/office/drawing/2016/5/10/chartex" xmlns:cx5="http://schemas.microsoft.com/office/drawing/2016/5/11/chartex" xmlns:cx6="http://schemas.microsoft.com/office/drawing/2016/5/12/chartex" xmlns:cx7="http://schemas.microsoft.com/office/drawing/2016/5/13/chartex" xmlns:cx8="http://schemas.microsoft.com/office/drawing/2016/5/14/chartex" xmlns:mc="http://schemas.openxmlformats.org/markup-compatibility/2006" xmlns:aink="http://schemas.microsoft.com/office/drawing/2016/ink" xmlns:am3d="http://schemas.microsoft.com/office/drawing/2017/model3d" xmlns:o="urn:schemas-microsoft-com:office:office" xmlns:oel="http://schemas.microsoft.com/office/2019/extlst" xmlns:r="http://schemas.openxmlformats.org/officeDocument/2006/relationships" xmlns:m="http://schemas.openxmlformats.org/officeDocument/2006/math" xmlns:v="urn:schemas-microsoft-com:vml" xmlns:wp14="http://schemas.microsoft.com/office/word/2010/wordprocessingDrawing" xmlns:wp="http://schemas.openxmlformats.org/drawingml/2006/wordprocessingDrawing" xmlns:w10="urn:schemas-microsoft-com:office:word" xmlns:w="http://schemas.openxmlformats.org/wordprocessingml/2006/main" xmlns:w14="http://schemas.microsoft.com/office/word/2010/wordml" xmlns:w15="http://schemas.microsoft.com/office/word/2012/wordml" xmlns:w16cei="http://schemas.microsoft.com/office/word/2026/wordml/cei" xmlns:w16cex="http://schemas.microsoft.com/office/word/2018/wordml/cex" xmlns:w16cid="http://schemas.microsoft.com/office/word/2016/wordml/cid" xmlns:w16="http://schemas.microsoft.com/office/word/2018/wordml" xmlns:w16du="http://schemas.microsoft.com/office/word/2023/wordml/word16du" xmlns:w16sdtdh="http://schemas.microsoft.com/office/word/2020/wordml/sdtdatahash" xmlns:w16sdtfl="http://schemas.microsoft.com/office/word/2024/wordml/sdtformatlock" xmlns:w16se="http://schemas.microsoft.com/office/word/2015/wordml/symex" xmlns:wpg="http://schemas.microsoft.com/office/word/2010/wordprocessingGroup" xmlns:wpi="http://schemas.microsoft.com/office/word/2010/wordprocessingInk" xmlns:wne="http://schemas.microsoft.com/office/word/2006/wordml" xmlns:wps="http://schemas.microsoft.com/office/word/2010/wordprocessingShape" mc:Ignorable="w14 w15 w16se w16cid w16 w16cex w16sdtdh w16sdtfl w16du wp14">
+<w:hdr xmlns:wpc="http://schemas.microsoft.com/office/word/2010/wordprocessingCanvas" xmlns:cx="http://schemas.microsoft.com/office/drawing/2014/chartex" xmlns:cx1="http://schemas.microsoft.com/office/drawing/2015/9/8/chartex" xmlns:cx2="http://schemas.microsoft.com/office/drawing/2015/10/21/chartex" xmlns:cx3="http://schemas.microsoft.com/office/drawing/2016/5/9/chartex" xmlns:cx4="http://schemas.microsoft.com/office/drawing/2016/5/10/chartex" xmlns:cx5="http://schemas.microsoft.com/office/drawing/2016/5/11/chartex" xmlns:cx6="http://schemas.microsoft.com/office/drawing/2016/5/12/chartex" xmlns:cx7="http://schemas.microsoft.com/office/drawing/2016/5/13/chartex" xmlns:cx8="http://schemas.microsoft.com/office/drawing/2016/5/14/chartex" xmlns:mc="http://schemas.openxmlformats.org/markup-compatibility/2006" xmlns:aink="http://schemas.microsoft.com/office/drawing/2016/ink" xmlns:am3d="http://schemas.microsoft.com/office/drawing/2017/model3d" xmlns:o="urn:schemas-microsoft-com:office:office" xmlns:oel="http://schemas.microsoft.com/office/2019/extlst" xmlns:r="http://schemas.openxmlformats.org/officeDocument/2006/relationships" xmlns:m="http://schemas.openxmlformats.org/officeDocument/2006/math" xmlns:v="urn:schemas-microsoft-com:vml" xmlns:wp14="http://schemas.microsoft.com/office/word/2010/wordprocessingDrawing" xmlns:wp="http://schemas.openxmlformats.org/drawingml/2006/wordprocessingDrawing" xmlns:w10="urn:schemas-microsoft-com:office:word" xmlns:w="http://schemas.openxmlformats.org/wordprocessingml/2006/main" xmlns:w14="http://schemas.microsoft.com/office/word/2010/wordml" xmlns:w15="http://schemas.microsoft.com/office/word/2012/wordml" xmlns:w16cex="http://schemas.microsoft.com/office/word/2018/wordml/cex" xmlns:w16cid="http://schemas.microsoft.com/office/word/2016/wordml/cid" xmlns:w16="http://schemas.microsoft.com/office/word/2018/wordml" xmlns:w16du="http://schemas.microsoft.com/office/word/2023/wordml/word16du" xmlns:w16sdtdh="http://schemas.microsoft.com/office/word/2020/wordml/sdtdatahash" xmlns:w16sdtfl="http://schemas.microsoft.com/office/word/2024/wordml/sdtformatlock" xmlns:w16se="http://schemas.microsoft.com/office/word/2015/wordml/symex" xmlns:wpg="http://schemas.microsoft.com/office/word/2010/wordprocessingGroup" xmlns:wpi="http://schemas.microsoft.com/office/word/2010/wordprocessingInk" xmlns:wne="http://schemas.microsoft.com/office/word/2006/wordml" xmlns:wps="http://schemas.microsoft.com/office/word/2010/wordprocessingShape" mc:Ignorable="w14 w15 w16se w16cid w16 w16cex w16sdtdh w16sdtfl w16du wp14">
   <w:p>
     <w:pPr>
       <w:pStyle w:val="Header"/>
@@ -614,7 +771,7 @@
 </file>
 
 <file path=word/numbering.xml><?xml version="1.0" encoding="utf-8"?>
-<w:numbering xmlns:wpc="http://schemas.microsoft.com/office/word/2010/wordprocessingCanvas" xmlns:cx="http://schemas.microsoft.com/office/drawing/2014/chartex" xmlns:cx1="http://schemas.microsoft.com/office/drawing/2015/9/8/chartex" xmlns:cx2="http://schemas.microsoft.com/office/drawing/2015/10/21/chartex" xmlns:cx3="http://schemas.microsoft.com/office/drawing/2016/5/9/chartex" xmlns:cx4="http://schemas.microsoft.com/office/drawing/2016/5/10/chartex" xmlns:cx5="http://schemas.microsoft.com/office/drawing/2016/5/11/chartex" xmlns:cx6="http://schemas.microsoft.com/office/drawing/2016/5/12/chartex" xmlns:cx7="http://schemas.microsoft.com/office/drawing/2016/5/13/chartex" xmlns:cx8="http://schemas.microsoft.com/office/drawing/2016/5/14/chartex" xmlns:mc="http://schemas.openxmlformats.org/markup-compatibility/2006" xmlns:aink="http://schemas.microsoft.com/office/drawing/2016/ink" xmlns:am3d="http://schemas.microsoft.com/office/drawing/2017/model3d" xmlns:o="urn:schemas-microsoft-com:office:office" xmlns:oel="http://schemas.microsoft.com/office/2019/extlst" xmlns:r="http://schemas.openxmlformats.org/officeDocument/2006/relationships" xmlns:m="http://schemas.openxmlformats.org/officeDocument/2006/math" xmlns:v="urn:schemas-microsoft-com:vml" xmlns:wp14="http://schemas.microsoft.com/office/word/2010/wordprocessingDrawing" xmlns:wp="http://schemas.openxmlformats.org/drawingml/2006/wordprocessingDrawing" xmlns:w10="urn:schemas-microsoft-com:office:word" xmlns:w="http://schemas.openxmlformats.org/wordprocessingml/2006/main" xmlns:w14="http://schemas.microsoft.com/office/word/2010/wordml" xmlns:w15="http://schemas.microsoft.com/office/word/2012/wordml" xmlns:w16cei="http://schemas.microsoft.com/office/word/2026/wordml/cei" xmlns:w16cex="http://schemas.microsoft.com/office/word/2018/wordml/cex" xmlns:w16cid="http://schemas.microsoft.com/office/word/2016/wordml/cid" xmlns:w16="http://schemas.microsoft.com/office/word/2018/wordml" xmlns:w16du="http://schemas.microsoft.com/office/word/2023/wordml/word16du" xmlns:w16sdtdh="http://schemas.microsoft.com/office/word/2020/wordml/sdtdatahash" xmlns:w16sdtfl="http://schemas.microsoft.com/office/word/2024/wordml/sdtformatlock" xmlns:w16se="http://schemas.microsoft.com/office/word/2015/wordml/symex" xmlns:wpg="http://schemas.microsoft.com/office/word/2010/wordprocessingGroup" xmlns:wpi="http://schemas.microsoft.com/office/word/2010/wordprocessingInk" xmlns:wne="http://schemas.microsoft.com/office/word/2006/wordml" xmlns:wps="http://schemas.microsoft.com/office/word/2010/wordprocessingShape" mc:Ignorable="w14 w15 w16se w16cid w16 w16cex w16sdtdh w16sdtfl w16du wp14">
+<w:numbering xmlns:wpc="http://schemas.microsoft.com/office/word/2010/wordprocessingCanvas" xmlns:cx="http://schemas.microsoft.com/office/drawing/2014/chartex" xmlns:cx1="http://schemas.microsoft.com/office/drawing/2015/9/8/chartex" xmlns:cx2="http://schemas.microsoft.com/office/drawing/2015/10/21/chartex" xmlns:cx3="http://schemas.microsoft.com/office/drawing/2016/5/9/chartex" xmlns:cx4="http://schemas.microsoft.com/office/drawing/2016/5/10/chartex" xmlns:cx5="http://schemas.microsoft.com/office/drawing/2016/5/11/chartex" xmlns:cx6="http://schemas.microsoft.com/office/drawing/2016/5/12/chartex" xmlns:cx7="http://schemas.microsoft.com/office/drawing/2016/5/13/chartex" xmlns:cx8="http://schemas.microsoft.com/office/drawing/2016/5/14/chartex" xmlns:mc="http://schemas.openxmlformats.org/markup-compatibility/2006" xmlns:aink="http://schemas.microsoft.com/office/drawing/2016/ink" xmlns:am3d="http://schemas.microsoft.com/office/drawing/2017/model3d" xmlns:o="urn:schemas-microsoft-com:office:office" xmlns:oel="http://schemas.microsoft.com/office/2019/extlst" xmlns:r="http://schemas.openxmlformats.org/officeDocument/2006/relationships" xmlns:m="http://schemas.openxmlformats.org/officeDocument/2006/math" xmlns:v="urn:schemas-microsoft-com:vml" xmlns:wp14="http://schemas.microsoft.com/office/word/2010/wordprocessingDrawing" xmlns:wp="http://schemas.openxmlformats.org/drawingml/2006/wordprocessingDrawing" xmlns:w10="urn:schemas-microsoft-com:office:word" xmlns:w="http://schemas.openxmlformats.org/wordprocessingml/2006/main" xmlns:w14="http://schemas.microsoft.com/office/word/2010/wordml" xmlns:w15="http://schemas.microsoft.com/office/word/2012/wordml" xmlns:w16cex="http://schemas.microsoft.com/office/word/2018/wordml/cex" xmlns:w16cid="http://schemas.microsoft.com/office/word/2016/wordml/cid" xmlns:w16="http://schemas.microsoft.com/office/word/2018/wordml" xmlns:w16du="http://schemas.microsoft.com/office/word/2023/wordml/word16du" xmlns:w16sdtdh="http://schemas.microsoft.com/office/word/2020/wordml/sdtdatahash" xmlns:w16sdtfl="http://schemas.microsoft.com/office/word/2024/wordml/sdtformatlock" xmlns:w16se="http://schemas.microsoft.com/office/word/2015/wordml/symex" xmlns:wpg="http://schemas.microsoft.com/office/word/2010/wordprocessingGroup" xmlns:wpi="http://schemas.microsoft.com/office/word/2010/wordprocessingInk" xmlns:wne="http://schemas.microsoft.com/office/word/2006/wordml" xmlns:wps="http://schemas.microsoft.com/office/word/2010/wordprocessingShape" mc:Ignorable="w14 w15 w16se w16cid w16 w16cex w16sdtdh w16sdtfl w16du wp14">
   <w:abstractNum w:abstractNumId="0" w15:restartNumberingAfterBreak="0">
     <w:nsid w:val="FFFFFFFB"/>
     <w:multiLevelType w:val="multilevel"/>

</xml_diff>